<commit_message>
Ref Patlak -- replace Deprenyl model with Bergström (instead of Johansson)
</commit_message>
<xml_diff>
--- a/imlook4d/DOCS/Models_exported_to_html/Models.docx
+++ b/imlook4d/DOCS/Models_exported_to_html/Models.docx
@@ -1,10 +1,10 @@
 
 <file path=word/document.xml><?xml version="1.0" encoding="utf-8"?>
-<w:document xmlns:wpc="http://schemas.microsoft.com/office/word/2010/wordprocessingCanvas" xmlns:cx="http://schemas.microsoft.com/office/drawing/2014/chartex" xmlns:cx1="http://schemas.microsoft.com/office/drawing/2015/9/8/chartex" xmlns:cx2="http://schemas.microsoft.com/office/drawing/2015/10/21/chartex" xmlns:cx3="http://schemas.microsoft.com/office/drawing/2016/5/9/chartex" xmlns:cx4="http://schemas.microsoft.com/office/drawing/2016/5/10/chartex" xmlns:cx5="http://schemas.microsoft.com/office/drawing/2016/5/11/chartex" xmlns:cx6="http://schemas.microsoft.com/office/drawing/2016/5/12/chartex" xmlns:cx7="http://schemas.microsoft.com/office/drawing/2016/5/13/chartex" xmlns:cx8="http://schemas.microsoft.com/office/drawing/2016/5/14/chartex" xmlns:mc="http://schemas.openxmlformats.org/markup-compatibility/2006" xmlns:aink="http://schemas.microsoft.com/office/drawing/2016/ink" xmlns:am3d="http://schemas.microsoft.com/office/drawing/2017/model3d" xmlns:o="urn:schemas-microsoft-com:office:office" xmlns:r="http://schemas.openxmlformats.org/officeDocument/2006/relationships" xmlns:m="http://schemas.openxmlformats.org/officeDocument/2006/math" xmlns:v="urn:schemas-microsoft-com:vml" xmlns:wp14="http://schemas.microsoft.com/office/word/2010/wordprocessingDrawing" xmlns:wp="http://schemas.openxmlformats.org/drawingml/2006/wordprocessingDrawing" xmlns:w10="urn:schemas-microsoft-com:office:word" xmlns:w="http://schemas.openxmlformats.org/wordprocessingml/2006/main" xmlns:w14="http://schemas.microsoft.com/office/word/2010/wordml" xmlns:w15="http://schemas.microsoft.com/office/word/2012/wordml" xmlns:w16cex="http://schemas.microsoft.com/office/word/2018/wordml/cex" xmlns:w16cid="http://schemas.microsoft.com/office/word/2016/wordml/cid" xmlns:w16="http://schemas.microsoft.com/office/word/2018/wordml" xmlns:w16sdtdh="http://schemas.microsoft.com/office/word/2020/wordml/sdtdatahash" xmlns:w16se="http://schemas.microsoft.com/office/word/2015/wordml/symex" xmlns:wpg="http://schemas.microsoft.com/office/word/2010/wordprocessingGroup" xmlns:wpi="http://schemas.microsoft.com/office/word/2010/wordprocessingInk" xmlns:wne="http://schemas.microsoft.com/office/word/2006/wordml" xmlns:wps="http://schemas.microsoft.com/office/word/2010/wordprocessingShape" mc:Ignorable="w14 w15 w16se w16cid w16 w16cex w16sdtdh wp14">
+<w:document xmlns:wpc="http://schemas.microsoft.com/office/word/2010/wordprocessingCanvas" xmlns:cx="http://schemas.microsoft.com/office/drawing/2014/chartex" xmlns:cx1="http://schemas.microsoft.com/office/drawing/2015/9/8/chartex" xmlns:cx2="http://schemas.microsoft.com/office/drawing/2015/10/21/chartex" xmlns:cx3="http://schemas.microsoft.com/office/drawing/2016/5/9/chartex" xmlns:cx4="http://schemas.microsoft.com/office/drawing/2016/5/10/chartex" xmlns:cx5="http://schemas.microsoft.com/office/drawing/2016/5/11/chartex" xmlns:cx6="http://schemas.microsoft.com/office/drawing/2016/5/12/chartex" xmlns:cx7="http://schemas.microsoft.com/office/drawing/2016/5/13/chartex" xmlns:cx8="http://schemas.microsoft.com/office/drawing/2016/5/14/chartex" xmlns:mc="http://schemas.openxmlformats.org/markup-compatibility/2006" xmlns:aink="http://schemas.microsoft.com/office/drawing/2016/ink" xmlns:am3d="http://schemas.microsoft.com/office/drawing/2017/model3d" xmlns:o="urn:schemas-microsoft-com:office:office" xmlns:oel="http://schemas.microsoft.com/office/2019/extlst" xmlns:r="http://schemas.openxmlformats.org/officeDocument/2006/relationships" xmlns:m="http://schemas.openxmlformats.org/officeDocument/2006/math" xmlns:v="urn:schemas-microsoft-com:vml" xmlns:wp14="http://schemas.microsoft.com/office/word/2010/wordprocessingDrawing" xmlns:wp="http://schemas.openxmlformats.org/drawingml/2006/wordprocessingDrawing" xmlns:w10="urn:schemas-microsoft-com:office:word" xmlns:w="http://schemas.openxmlformats.org/wordprocessingml/2006/main" xmlns:w14="http://schemas.microsoft.com/office/word/2010/wordml" xmlns:w15="http://schemas.microsoft.com/office/word/2012/wordml" xmlns:w16cex="http://schemas.microsoft.com/office/word/2018/wordml/cex" xmlns:w16cid="http://schemas.microsoft.com/office/word/2016/wordml/cid" xmlns:w16="http://schemas.microsoft.com/office/word/2018/wordml" xmlns:w16du="http://schemas.microsoft.com/office/word/2023/wordml/word16du" xmlns:w16sdtdh="http://schemas.microsoft.com/office/word/2020/wordml/sdtdatahash" xmlns:w16sdtfl="http://schemas.microsoft.com/office/word/2024/wordml/sdtformatlock" xmlns:w16se="http://schemas.microsoft.com/office/word/2015/wordml/symex" xmlns:wpg="http://schemas.microsoft.com/office/word/2010/wordprocessingGroup" xmlns:wpi="http://schemas.microsoft.com/office/word/2010/wordprocessingInk" xmlns:wne="http://schemas.microsoft.com/office/word/2006/wordml" xmlns:wps="http://schemas.microsoft.com/office/word/2010/wordprocessingShape" mc:Ignorable="w14 w15 w16se w16cid w16 w16cex w16sdtdh w16sdtfl w16du wp14">
   <w:body>
     <w:p>
       <w:pPr>
-        <w:pStyle w:val="Rubrik"/>
+        <w:pStyle w:val="Title"/>
       </w:pPr>
       <w:r>
         <w:t>Pharmaco-kinetic models</w:t>
@@ -409,7 +409,7 @@
     </w:p>
     <w:p>
       <w:pPr>
-        <w:pStyle w:val="Rubrik2"/>
+        <w:pStyle w:val="Heading2"/>
         <w:rPr>
           <w:rFonts w:hint="eastAsia"/>
         </w:rPr>
@@ -420,7 +420,7 @@
     </w:p>
     <w:p>
       <w:pPr>
-        <w:pStyle w:val="Rubrik1"/>
+        <w:pStyle w:val="Heading1"/>
         <w:rPr>
           <w:rFonts w:hint="eastAsia"/>
         </w:rPr>
@@ -436,7 +436,15 @@
         <w:pStyle w:val="Textbody"/>
       </w:pPr>
       <w:r>
-        <w:t>Imlook4d handles a number of pharmaco-kinetic models for dynamic PET scans.</w:t>
+        <w:t xml:space="preserve">Imlook4d handles </w:t>
+      </w:r>
+      <w:proofErr w:type="gramStart"/>
+      <w:r>
+        <w:t>a number of</w:t>
+      </w:r>
+      <w:proofErr w:type="gramEnd"/>
+      <w:r>
+        <w:t xml:space="preserve"> pharmaco-kinetic models for dynamic PET scans.</w:t>
       </w:r>
     </w:p>
     <w:p>
@@ -462,7 +470,15 @@
         <w:t>or</w:t>
       </w:r>
       <w:r>
-        <w:t xml:space="preserve"> pixel, depending what you wish to calculate.</w:t>
+        <w:t xml:space="preserve"> pixel, </w:t>
+      </w:r>
+      <w:proofErr w:type="gramStart"/>
+      <w:r>
+        <w:t>depending</w:t>
+      </w:r>
+      <w:proofErr w:type="gramEnd"/>
+      <w:r>
+        <w:t xml:space="preserve"> what you wish to calculate.</w:t>
       </w:r>
     </w:p>
     <w:p>
@@ -483,7 +499,7 @@
     </w:p>
     <w:p>
       <w:pPr>
-        <w:pStyle w:val="Rubrik1"/>
+        <w:pStyle w:val="Heading1"/>
         <w:rPr>
           <w:rFonts w:hint="eastAsia"/>
         </w:rPr>
@@ -506,8 +522,21 @@
       <w:pPr>
         <w:pStyle w:val="Textbody"/>
       </w:pPr>
-      <w:r>
-        <w:t>In order to calculate a model, a reference region has to be defined.</w:t>
+      <w:proofErr w:type="gramStart"/>
+      <w:r>
+        <w:t>In order to</w:t>
+      </w:r>
+      <w:proofErr w:type="gramEnd"/>
+      <w:r>
+        <w:t xml:space="preserve"> calculate a model, a reference region </w:t>
+      </w:r>
+      <w:proofErr w:type="gramStart"/>
+      <w:r>
+        <w:t>has to</w:t>
+      </w:r>
+      <w:proofErr w:type="gramEnd"/>
+      <w:r>
+        <w:t xml:space="preserve"> be defined.</w:t>
       </w:r>
     </w:p>
     <w:p>
@@ -520,13 +549,14 @@
     </w:p>
     <w:p>
       <w:pPr>
-        <w:pStyle w:val="Rubrik1"/>
+        <w:pStyle w:val="Heading1"/>
         <w:rPr>
           <w:rFonts w:hint="eastAsia"/>
         </w:rPr>
       </w:pPr>
       <w:bookmarkStart w:id="2" w:name="__RefHeading___Toc3064_1138715457"/>
       <w:r>
+        <w:lastRenderedPageBreak/>
         <w:t>Input Functions</w:t>
       </w:r>
       <w:bookmarkEnd w:id="2"/>
@@ -552,14 +582,27 @@
       <w:pPr>
         <w:pStyle w:val="Textbody"/>
       </w:pPr>
-      <w:r>
-        <w:t xml:space="preserve">In order to calculate a model, </w:t>
+      <w:proofErr w:type="gramStart"/>
+      <w:r>
+        <w:t>In order to</w:t>
+      </w:r>
+      <w:proofErr w:type="gramEnd"/>
+      <w:r>
+        <w:t xml:space="preserve"> calculate a model, </w:t>
       </w:r>
       <w:r>
         <w:t>the</w:t>
       </w:r>
       <w:r>
-        <w:t xml:space="preserve"> input function has to be defined.</w:t>
+        <w:t xml:space="preserve"> input function </w:t>
+      </w:r>
+      <w:proofErr w:type="gramStart"/>
+      <w:r>
+        <w:t>has to</w:t>
+      </w:r>
+      <w:proofErr w:type="gramEnd"/>
+      <w:r>
+        <w:t xml:space="preserve"> be defined.</w:t>
       </w:r>
     </w:p>
     <w:p>
@@ -567,7 +610,15 @@
         <w:pStyle w:val="Textbody"/>
       </w:pPr>
       <w:r>
-        <w:t xml:space="preserve">In imlook4d, the input function is stored in a variable (Cinp is a good name, but you are free to </w:t>
+        <w:t>In imlook4d, the input function is stored in a variable (</w:t>
+      </w:r>
+      <w:proofErr w:type="spellStart"/>
+      <w:r>
+        <w:t>Cinp</w:t>
+      </w:r>
+      <w:proofErr w:type="spellEnd"/>
+      <w:r>
+        <w:t xml:space="preserve"> is a good name, but you are free to </w:t>
       </w:r>
       <w:r>
         <w:t>choose</w:t>
@@ -578,7 +629,7 @@
     </w:p>
     <w:p>
       <w:pPr>
-        <w:pStyle w:val="Rubrik1"/>
+        <w:pStyle w:val="Heading1"/>
         <w:rPr>
           <w:rFonts w:hint="eastAsia"/>
         </w:rPr>
@@ -599,7 +650,7 @@
     </w:p>
     <w:p>
       <w:pPr>
-        <w:pStyle w:val="Rubrik1"/>
+        <w:pStyle w:val="Heading1"/>
         <w:rPr>
           <w:rFonts w:hint="eastAsia"/>
         </w:rPr>
@@ -620,7 +671,7 @@
     </w:p>
     <w:p>
       <w:pPr>
-        <w:pStyle w:val="Rubrik1"/>
+        <w:pStyle w:val="Heading1"/>
         <w:rPr>
           <w:rFonts w:hint="eastAsia"/>
         </w:rPr>
@@ -644,7 +695,15 @@
         <w:pStyle w:val="Textbody"/>
       </w:pPr>
       <w:r>
-        <w:t>Examples of such methods are Logan, Zhou, and Patlak plots (see below).</w:t>
+        <w:t xml:space="preserve">Examples of such methods are Logan, Zhou, and </w:t>
+      </w:r>
+      <w:proofErr w:type="spellStart"/>
+      <w:r>
+        <w:t>Patlak</w:t>
+      </w:r>
+      <w:proofErr w:type="spellEnd"/>
+      <w:r>
+        <w:t xml:space="preserve"> plots (see below).</w:t>
       </w:r>
     </w:p>
     <w:p>
@@ -652,7 +711,23 @@
         <w:pStyle w:val="Textbody"/>
       </w:pPr>
       <w:r>
-        <w:t xml:space="preserve">These methods have in common that the start and end of the linear phase has to be defined by the user.  Therefore, typically data is analyzed graphically for ROIs (menu “SCRIPTS/Model on ROIs”), and the user makes a guess of </w:t>
+        <w:t xml:space="preserve">These methods have in common that the start and end of the linear phase </w:t>
+      </w:r>
+      <w:proofErr w:type="gramStart"/>
+      <w:r>
+        <w:t>has</w:t>
+      </w:r>
+      <w:proofErr w:type="gramEnd"/>
+      <w:r>
+        <w:t xml:space="preserve"> to be defined by the user.  Therefore, typically data is </w:t>
+      </w:r>
+      <w:proofErr w:type="spellStart"/>
+      <w:r>
+        <w:t>analyzed</w:t>
+      </w:r>
+      <w:proofErr w:type="spellEnd"/>
+      <w:r>
+        <w:t xml:space="preserve"> graphically for ROIs (menu “SCRIPTS/Model on ROIs”), and the user makes a guess of </w:t>
       </w:r>
       <w:r>
         <w:rPr>
@@ -750,6 +825,7 @@
         <w:rPr>
           <w:noProof/>
         </w:rPr>
+        <w:lastRenderedPageBreak/>
         <w:drawing>
           <wp:inline distT="0" distB="0" distL="0" distR="0" wp14:anchorId="6D8B0090" wp14:editId="08A17A5E">
             <wp:extent cx="4044239" cy="2748240"/>
@@ -808,8 +884,9 @@
           <w:szCs w:val="20"/>
         </w:rPr>
         <w:br/>
-        <w:t xml:space="preserve">Left), Logan plot for one reference (ROI2) inidicated with “*”, and one region of interest (ROI1).  </w:t>
-      </w:r>
+        <w:t xml:space="preserve">Left), Logan plot for one reference (ROI2) </w:t>
+      </w:r>
+      <w:proofErr w:type="spellStart"/>
       <w:r>
         <w:rPr>
           <w:i/>
@@ -817,13 +894,32 @@
           <w:sz w:val="20"/>
           <w:szCs w:val="20"/>
         </w:rPr>
+        <w:t>inidicated</w:t>
+      </w:r>
+      <w:proofErr w:type="spellEnd"/>
+      <w:r>
+        <w:rPr>
+          <w:i/>
+          <w:iCs/>
+          <w:sz w:val="20"/>
+          <w:szCs w:val="20"/>
+        </w:rPr>
+        <w:t xml:space="preserve"> with “*”, and one region of interest (ROI1).  </w:t>
+      </w:r>
+      <w:r>
+        <w:rPr>
+          <w:i/>
+          <w:iCs/>
+          <w:sz w:val="20"/>
+          <w:szCs w:val="20"/>
+        </w:rPr>
         <w:br/>
         <w:t>Right) the same graph zoomed in to see that the line fits the linear phase of the curve of the region of interest.</w:t>
       </w:r>
     </w:p>
     <w:p>
       <w:pPr>
-        <w:pStyle w:val="Rubrik1"/>
+        <w:pStyle w:val="Heading1"/>
         <w:rPr>
           <w:rFonts w:hint="eastAsia"/>
         </w:rPr>
@@ -859,6 +955,7 @@
       <w:r>
         <w:t xml:space="preserve">, which is a combined measure of available receptor density </w:t>
       </w:r>
+      <w:proofErr w:type="spellStart"/>
       <w:r>
         <w:rPr>
           <w:i/>
@@ -874,6 +971,7 @@
         </w:rPr>
         <w:t>avail</w:t>
       </w:r>
+      <w:proofErr w:type="spellEnd"/>
       <w:r>
         <w:rPr>
           <w:i/>
@@ -920,6 +1018,7 @@
       <w:r>
         <w:t xml:space="preserve">= </w:t>
       </w:r>
+      <w:proofErr w:type="spellStart"/>
       <w:r>
         <w:rPr>
           <w:i/>
@@ -935,6 +1034,7 @@
         </w:rPr>
         <w:t>avail</w:t>
       </w:r>
+      <w:proofErr w:type="spellEnd"/>
       <w:r>
         <w:rPr>
           <w:i/>
@@ -967,7 +1067,7 @@
     </w:p>
     <w:p>
       <w:pPr>
-        <w:pStyle w:val="Rubrik2"/>
+        <w:pStyle w:val="Heading2"/>
         <w:rPr>
           <w:rFonts w:hint="eastAsia"/>
         </w:rPr>
@@ -1110,7 +1210,7 @@
     </w:p>
     <w:p>
       <w:pPr>
-        <w:pStyle w:val="Rubrik2"/>
+        <w:pStyle w:val="Heading2"/>
         <w:rPr>
           <w:rFonts w:hint="eastAsia"/>
         </w:rPr>
@@ -1171,6 +1271,9 @@
       </w:r>
       <w:r>
         <w:br/>
+      </w:r>
+      <w:r>
+        <w:lastRenderedPageBreak/>
         <w:t>Zhou is preferred over Logan for model images, since it is more robust on noisy data.</w:t>
       </w:r>
     </w:p>
@@ -1204,7 +1307,7 @@
     </w:p>
     <w:p>
       <w:pPr>
-        <w:pStyle w:val="Rubrik2"/>
+        <w:pStyle w:val="Heading2"/>
         <w:rPr>
           <w:rFonts w:hint="eastAsia"/>
         </w:rPr>
@@ -1407,7 +1510,7 @@
     </w:p>
     <w:p>
       <w:pPr>
-        <w:pStyle w:val="Rubrik2"/>
+        <w:pStyle w:val="Heading2"/>
         <w:rPr>
           <w:rFonts w:hint="eastAsia"/>
         </w:rPr>
@@ -1625,7 +1728,7 @@
     </w:p>
     <w:p>
       <w:pPr>
-        <w:pStyle w:val="Rubrik2"/>
+        <w:pStyle w:val="Heading2"/>
         <w:rPr>
           <w:rFonts w:hint="eastAsia"/>
         </w:rPr>
@@ -1840,6 +1943,7 @@
         <w:br/>
       </w:r>
       <w:r>
+        <w:lastRenderedPageBreak/>
         <w:t xml:space="preserve">- </w:t>
       </w:r>
       <w:r>
@@ -2196,7 +2300,7 @@
     </w:p>
     <w:p>
       <w:pPr>
-        <w:pStyle w:val="Rubrik1"/>
+        <w:pStyle w:val="Heading1"/>
         <w:rPr>
           <w:rFonts w:hint="eastAsia"/>
         </w:rPr>
@@ -2209,18 +2313,23 @@
     </w:p>
     <w:p>
       <w:pPr>
-        <w:pStyle w:val="Rubrik2"/>
+        <w:pStyle w:val="Heading2"/>
         <w:rPr>
           <w:rFonts w:hint="eastAsia"/>
         </w:rPr>
       </w:pPr>
-      <w:bookmarkStart w:id="13" w:name="__RefHeading___Toc735_731585586"/>
-      <w:bookmarkStart w:id="14" w:name="_Patlak_Model"/>
+      <w:bookmarkStart w:id="13" w:name="_Patlak_Model"/>
+      <w:bookmarkStart w:id="14" w:name="__RefHeading___Toc735_731585586"/>
+      <w:bookmarkEnd w:id="13"/>
+      <w:proofErr w:type="spellStart"/>
+      <w:r>
+        <w:t>Patlak</w:t>
+      </w:r>
+      <w:proofErr w:type="spellEnd"/>
+      <w:r>
+        <w:t xml:space="preserve"> Model</w:t>
+      </w:r>
       <w:bookmarkEnd w:id="14"/>
-      <w:r>
-        <w:t>Patlak Model</w:t>
-      </w:r>
-      <w:bookmarkEnd w:id="13"/>
     </w:p>
     <w:p>
       <w:pPr>
@@ -2234,7 +2343,15 @@
         </w:tabs>
       </w:pPr>
       <w:r>
-        <w:t xml:space="preserve">builds on the notion that after a while the blood plasma activity changes slowly, and the reversible compartments have reached a steady-state equilibrium with plasma (reversible compartments activity will be proportional to the plasma activity). This way the blood and the irreversible compartments can be viewed as an input function, with a single irreversible compartment constantly accumulating activity. The Patlak model calculates: </w:t>
+        <w:t xml:space="preserve">builds on the notion that after a while the blood plasma activity changes slowly, and the reversible compartments have reached a steady-state equilibrium with plasma (reversible compartments activity will be proportional to the plasma activity). This way the blood and the irreversible compartments can be viewed as an input function, with a single irreversible compartment constantly accumulating activity. The </w:t>
+      </w:r>
+      <w:proofErr w:type="spellStart"/>
+      <w:r>
+        <w:t>Patlak</w:t>
+      </w:r>
+      <w:proofErr w:type="spellEnd"/>
+      <w:r>
+        <w:t xml:space="preserve"> model calculates: </w:t>
       </w:r>
       <w:r>
         <w:br/>
@@ -2285,7 +2402,15 @@
       </w:r>
       <w:r>
         <w:tab/>
-        <w:t>and one of the metabolites are radioactive, advanced metabolite measurements and corrections have to be performed.</w:t>
+        <w:t xml:space="preserve">and one of the metabolites are radioactive, advanced metabolite measurements and corrections </w:t>
+      </w:r>
+      <w:proofErr w:type="gramStart"/>
+      <w:r>
+        <w:t>have to</w:t>
+      </w:r>
+      <w:proofErr w:type="gramEnd"/>
+      <w:r>
+        <w:t xml:space="preserve"> be performed.</w:t>
       </w:r>
       <w:r>
         <w:br/>
@@ -2335,14 +2460,22 @@
     </w:p>
     <w:p>
       <w:pPr>
-        <w:pStyle w:val="Rubrik2"/>
+        <w:pStyle w:val="Heading2"/>
         <w:rPr>
           <w:rFonts w:hint="eastAsia"/>
         </w:rPr>
       </w:pPr>
       <w:bookmarkStart w:id="15" w:name="__RefHeading___Toc737_731585586"/>
       <w:r>
-        <w:t>Reference Patlak Model</w:t>
+        <w:t xml:space="preserve">Reference </w:t>
+      </w:r>
+      <w:proofErr w:type="spellStart"/>
+      <w:r>
+        <w:t>Patlak</w:t>
+      </w:r>
+      <w:proofErr w:type="spellEnd"/>
+      <w:r>
+        <w:t xml:space="preserve"> Model</w:t>
       </w:r>
       <w:bookmarkEnd w:id="15"/>
     </w:p>
@@ -2355,7 +2488,15 @@
         </w:numPr>
       </w:pPr>
       <w:r>
-        <w:t xml:space="preserve">uses the same principle as Patlak model </w:t>
+        <w:t xml:space="preserve">uses the same principle as </w:t>
+      </w:r>
+      <w:proofErr w:type="spellStart"/>
+      <w:r>
+        <w:t>Patlak</w:t>
+      </w:r>
+      <w:proofErr w:type="spellEnd"/>
+      <w:r>
+        <w:t xml:space="preserve"> model </w:t>
       </w:r>
       <w:r>
         <w:t>above but</w:t>
@@ -2365,7 +2506,18 @@
       </w:r>
       <w:r>
         <w:br/>
-        <w:t xml:space="preserve">The Reference Patlak model calculates: </w:t>
+      </w:r>
+      <w:r>
+        <w:lastRenderedPageBreak/>
+        <w:t xml:space="preserve">The Reference </w:t>
+      </w:r>
+      <w:proofErr w:type="spellStart"/>
+      <w:r>
+        <w:t>Patlak</w:t>
+      </w:r>
+      <w:proofErr w:type="spellEnd"/>
+      <w:r>
+        <w:t xml:space="preserve"> model calculates: </w:t>
       </w:r>
       <w:r>
         <w:br/>
@@ -2439,7 +2591,7 @@
           <w:rPr>
             <w:rStyle w:val="Internetlink"/>
           </w:rPr>
-          <w:t>https://doi.org/doi:10.1016/j.jns.2007.01.057</w:t>
+          <w:t>https://doi.org/10.1111/j.1600-0404.1998.tb07300.x</w:t>
         </w:r>
       </w:hyperlink>
       <w:r>
@@ -2490,7 +2642,21 @@
         <w:rPr>
           <w:rStyle w:val="Internetlink"/>
         </w:rPr>
-        <w:t xml:space="preserve"> (Patlak)</w:t>
+        <w:t xml:space="preserve"> (</w:t>
+      </w:r>
+      <w:proofErr w:type="spellStart"/>
+      <w:r>
+        <w:rPr>
+          <w:rStyle w:val="Internetlink"/>
+        </w:rPr>
+        <w:t>Patlak</w:t>
+      </w:r>
+      <w:proofErr w:type="spellEnd"/>
+      <w:r>
+        <w:rPr>
+          <w:rStyle w:val="Internetlink"/>
+        </w:rPr>
+        <w:t>)</w:t>
       </w:r>
       <w:r>
         <w:rPr>
@@ -2509,11 +2675,14 @@
           <w:rPr>
             <w:rStyle w:val="Internetlink"/>
           </w:rPr>
-          <w:t>https://doi.org/doi:10.1016/j.jns.2007.01.057</w:t>
+          <w:t>https://doi.org/10.1111/j.1600-0404.1998.tb07300.x</w:t>
         </w:r>
       </w:hyperlink>
       <w:r>
-        <w:t xml:space="preserve"> (for  </w:t>
+        <w:t xml:space="preserve"> </w:t>
+      </w:r>
+      <w:r>
+        <w:t xml:space="preserve">(for  </w:t>
       </w:r>
       <w:r>
         <w:rPr>
@@ -2550,7 +2719,7 @@
     </w:p>
     <w:p>
       <w:pPr>
-        <w:pStyle w:val="Rubrik1"/>
+        <w:pStyle w:val="Heading1"/>
         <w:rPr>
           <w:rFonts w:hint="eastAsia"/>
         </w:rPr>
@@ -2577,7 +2746,7 @@
     </w:p>
     <w:p>
       <w:pPr>
-        <w:pStyle w:val="Rubrik2"/>
+        <w:pStyle w:val="Heading2"/>
         <w:rPr>
           <w:rFonts w:hint="eastAsia"/>
         </w:rPr>
@@ -2676,7 +2845,7 @@
     </w:p>
     <w:p>
       <w:pPr>
-        <w:pStyle w:val="Rubrik2"/>
+        <w:pStyle w:val="Heading2"/>
         <w:rPr>
           <w:rFonts w:hint="eastAsia"/>
         </w:rPr>
@@ -2722,10 +2891,18 @@
       <w:hyperlink w:anchor="_Patlak_Model" w:history="1">
         <w:r>
           <w:rPr>
-            <w:rStyle w:val="Hyperlnk"/>
+            <w:rStyle w:val="Hyperlink"/>
           </w:rPr>
-          <w:t>Notes on Patlak</w:t>
+          <w:t xml:space="preserve">Notes on </w:t>
         </w:r>
+        <w:proofErr w:type="spellStart"/>
+        <w:r>
+          <w:rPr>
+            <w:rStyle w:val="Hyperlink"/>
+          </w:rPr>
+          <w:t>Patlak</w:t>
+        </w:r>
+        <w:proofErr w:type="spellEnd"/>
       </w:hyperlink>
       <w:r>
         <w:t xml:space="preserve"> model, on how to generate an input function.</w:t>
@@ -2759,7 +2936,7 @@
 </file>
 
 <file path=word/endnotes.xml><?xml version="1.0" encoding="utf-8"?>
-<w:endnotes xmlns:wpc="http://schemas.microsoft.com/office/word/2010/wordprocessingCanvas" xmlns:cx="http://schemas.microsoft.com/office/drawing/2014/chartex" xmlns:cx1="http://schemas.microsoft.com/office/drawing/2015/9/8/chartex" xmlns:cx2="http://schemas.microsoft.com/office/drawing/2015/10/21/chartex" xmlns:cx3="http://schemas.microsoft.com/office/drawing/2016/5/9/chartex" xmlns:cx4="http://schemas.microsoft.com/office/drawing/2016/5/10/chartex" xmlns:cx5="http://schemas.microsoft.com/office/drawing/2016/5/11/chartex" xmlns:cx6="http://schemas.microsoft.com/office/drawing/2016/5/12/chartex" xmlns:cx7="http://schemas.microsoft.com/office/drawing/2016/5/13/chartex" xmlns:cx8="http://schemas.microsoft.com/office/drawing/2016/5/14/chartex" xmlns:mc="http://schemas.openxmlformats.org/markup-compatibility/2006" xmlns:aink="http://schemas.microsoft.com/office/drawing/2016/ink" xmlns:am3d="http://schemas.microsoft.com/office/drawing/2017/model3d" xmlns:o="urn:schemas-microsoft-com:office:office" xmlns:r="http://schemas.openxmlformats.org/officeDocument/2006/relationships" xmlns:m="http://schemas.openxmlformats.org/officeDocument/2006/math" xmlns:v="urn:schemas-microsoft-com:vml" xmlns:wp14="http://schemas.microsoft.com/office/word/2010/wordprocessingDrawing" xmlns:wp="http://schemas.openxmlformats.org/drawingml/2006/wordprocessingDrawing" xmlns:w10="urn:schemas-microsoft-com:office:word" xmlns:w="http://schemas.openxmlformats.org/wordprocessingml/2006/main" xmlns:w14="http://schemas.microsoft.com/office/word/2010/wordml" xmlns:w15="http://schemas.microsoft.com/office/word/2012/wordml" xmlns:w16cex="http://schemas.microsoft.com/office/word/2018/wordml/cex" xmlns:w16cid="http://schemas.microsoft.com/office/word/2016/wordml/cid" xmlns:w16="http://schemas.microsoft.com/office/word/2018/wordml" xmlns:w16sdtdh="http://schemas.microsoft.com/office/word/2020/wordml/sdtdatahash" xmlns:w16se="http://schemas.microsoft.com/office/word/2015/wordml/symex" xmlns:wpg="http://schemas.microsoft.com/office/word/2010/wordprocessingGroup" xmlns:wpi="http://schemas.microsoft.com/office/word/2010/wordprocessingInk" xmlns:wne="http://schemas.microsoft.com/office/word/2006/wordml" xmlns:wps="http://schemas.microsoft.com/office/word/2010/wordprocessingShape" mc:Ignorable="w14 w15 w16se w16cid w16 w16cex w16sdtdh wp14">
+<w:endnotes xmlns:wpc="http://schemas.microsoft.com/office/word/2010/wordprocessingCanvas" xmlns:cx="http://schemas.microsoft.com/office/drawing/2014/chartex" xmlns:cx1="http://schemas.microsoft.com/office/drawing/2015/9/8/chartex" xmlns:cx2="http://schemas.microsoft.com/office/drawing/2015/10/21/chartex" xmlns:cx3="http://schemas.microsoft.com/office/drawing/2016/5/9/chartex" xmlns:cx4="http://schemas.microsoft.com/office/drawing/2016/5/10/chartex" xmlns:cx5="http://schemas.microsoft.com/office/drawing/2016/5/11/chartex" xmlns:cx6="http://schemas.microsoft.com/office/drawing/2016/5/12/chartex" xmlns:cx7="http://schemas.microsoft.com/office/drawing/2016/5/13/chartex" xmlns:cx8="http://schemas.microsoft.com/office/drawing/2016/5/14/chartex" xmlns:mc="http://schemas.openxmlformats.org/markup-compatibility/2006" xmlns:aink="http://schemas.microsoft.com/office/drawing/2016/ink" xmlns:am3d="http://schemas.microsoft.com/office/drawing/2017/model3d" xmlns:o="urn:schemas-microsoft-com:office:office" xmlns:oel="http://schemas.microsoft.com/office/2019/extlst" xmlns:r="http://schemas.openxmlformats.org/officeDocument/2006/relationships" xmlns:m="http://schemas.openxmlformats.org/officeDocument/2006/math" xmlns:v="urn:schemas-microsoft-com:vml" xmlns:wp14="http://schemas.microsoft.com/office/word/2010/wordprocessingDrawing" xmlns:wp="http://schemas.openxmlformats.org/drawingml/2006/wordprocessingDrawing" xmlns:w10="urn:schemas-microsoft-com:office:word" xmlns:w="http://schemas.openxmlformats.org/wordprocessingml/2006/main" xmlns:w14="http://schemas.microsoft.com/office/word/2010/wordml" xmlns:w15="http://schemas.microsoft.com/office/word/2012/wordml" xmlns:w16cex="http://schemas.microsoft.com/office/word/2018/wordml/cex" xmlns:w16cid="http://schemas.microsoft.com/office/word/2016/wordml/cid" xmlns:w16="http://schemas.microsoft.com/office/word/2018/wordml" xmlns:w16du="http://schemas.microsoft.com/office/word/2023/wordml/word16du" xmlns:w16sdtdh="http://schemas.microsoft.com/office/word/2020/wordml/sdtdatahash" xmlns:w16sdtfl="http://schemas.microsoft.com/office/word/2024/wordml/sdtformatlock" xmlns:w16se="http://schemas.microsoft.com/office/word/2015/wordml/symex" xmlns:wpg="http://schemas.microsoft.com/office/word/2010/wordprocessingGroup" xmlns:wpi="http://schemas.microsoft.com/office/word/2010/wordprocessingInk" xmlns:wne="http://schemas.microsoft.com/office/word/2006/wordml" xmlns:wps="http://schemas.microsoft.com/office/word/2010/wordprocessingShape" mc:Ignorable="w14 w15 w16se w16cid w16 w16cex w16sdtdh w16sdtfl w16du wp14">
   <w:endnote w:type="separator" w:id="-1">
     <w:p>
       <w:r>
@@ -2778,7 +2955,7 @@
 </file>
 
 <file path=word/footnotes.xml><?xml version="1.0" encoding="utf-8"?>
-<w:footnotes xmlns:wpc="http://schemas.microsoft.com/office/word/2010/wordprocessingCanvas" xmlns:cx="http://schemas.microsoft.com/office/drawing/2014/chartex" xmlns:cx1="http://schemas.microsoft.com/office/drawing/2015/9/8/chartex" xmlns:cx2="http://schemas.microsoft.com/office/drawing/2015/10/21/chartex" xmlns:cx3="http://schemas.microsoft.com/office/drawing/2016/5/9/chartex" xmlns:cx4="http://schemas.microsoft.com/office/drawing/2016/5/10/chartex" xmlns:cx5="http://schemas.microsoft.com/office/drawing/2016/5/11/chartex" xmlns:cx6="http://schemas.microsoft.com/office/drawing/2016/5/12/chartex" xmlns:cx7="http://schemas.microsoft.com/office/drawing/2016/5/13/chartex" xmlns:cx8="http://schemas.microsoft.com/office/drawing/2016/5/14/chartex" xmlns:mc="http://schemas.openxmlformats.org/markup-compatibility/2006" xmlns:aink="http://schemas.microsoft.com/office/drawing/2016/ink" xmlns:am3d="http://schemas.microsoft.com/office/drawing/2017/model3d" xmlns:o="urn:schemas-microsoft-com:office:office" xmlns:r="http://schemas.openxmlformats.org/officeDocument/2006/relationships" xmlns:m="http://schemas.openxmlformats.org/officeDocument/2006/math" xmlns:v="urn:schemas-microsoft-com:vml" xmlns:wp14="http://schemas.microsoft.com/office/word/2010/wordprocessingDrawing" xmlns:wp="http://schemas.openxmlformats.org/drawingml/2006/wordprocessingDrawing" xmlns:w10="urn:schemas-microsoft-com:office:word" xmlns:w="http://schemas.openxmlformats.org/wordprocessingml/2006/main" xmlns:w14="http://schemas.microsoft.com/office/word/2010/wordml" xmlns:w15="http://schemas.microsoft.com/office/word/2012/wordml" xmlns:w16cex="http://schemas.microsoft.com/office/word/2018/wordml/cex" xmlns:w16cid="http://schemas.microsoft.com/office/word/2016/wordml/cid" xmlns:w16="http://schemas.microsoft.com/office/word/2018/wordml" xmlns:w16sdtdh="http://schemas.microsoft.com/office/word/2020/wordml/sdtdatahash" xmlns:w16se="http://schemas.microsoft.com/office/word/2015/wordml/symex" xmlns:wpg="http://schemas.microsoft.com/office/word/2010/wordprocessingGroup" xmlns:wpi="http://schemas.microsoft.com/office/word/2010/wordprocessingInk" xmlns:wne="http://schemas.microsoft.com/office/word/2006/wordml" xmlns:wps="http://schemas.microsoft.com/office/word/2010/wordprocessingShape" mc:Ignorable="w14 w15 w16se w16cid w16 w16cex w16sdtdh wp14">
+<w:footnotes xmlns:wpc="http://schemas.microsoft.com/office/word/2010/wordprocessingCanvas" xmlns:cx="http://schemas.microsoft.com/office/drawing/2014/chartex" xmlns:cx1="http://schemas.microsoft.com/office/drawing/2015/9/8/chartex" xmlns:cx2="http://schemas.microsoft.com/office/drawing/2015/10/21/chartex" xmlns:cx3="http://schemas.microsoft.com/office/drawing/2016/5/9/chartex" xmlns:cx4="http://schemas.microsoft.com/office/drawing/2016/5/10/chartex" xmlns:cx5="http://schemas.microsoft.com/office/drawing/2016/5/11/chartex" xmlns:cx6="http://schemas.microsoft.com/office/drawing/2016/5/12/chartex" xmlns:cx7="http://schemas.microsoft.com/office/drawing/2016/5/13/chartex" xmlns:cx8="http://schemas.microsoft.com/office/drawing/2016/5/14/chartex" xmlns:mc="http://schemas.openxmlformats.org/markup-compatibility/2006" xmlns:aink="http://schemas.microsoft.com/office/drawing/2016/ink" xmlns:am3d="http://schemas.microsoft.com/office/drawing/2017/model3d" xmlns:o="urn:schemas-microsoft-com:office:office" xmlns:oel="http://schemas.microsoft.com/office/2019/extlst" xmlns:r="http://schemas.openxmlformats.org/officeDocument/2006/relationships" xmlns:m="http://schemas.openxmlformats.org/officeDocument/2006/math" xmlns:v="urn:schemas-microsoft-com:vml" xmlns:wp14="http://schemas.microsoft.com/office/word/2010/wordprocessingDrawing" xmlns:wp="http://schemas.openxmlformats.org/drawingml/2006/wordprocessingDrawing" xmlns:w10="urn:schemas-microsoft-com:office:word" xmlns:w="http://schemas.openxmlformats.org/wordprocessingml/2006/main" xmlns:w14="http://schemas.microsoft.com/office/word/2010/wordml" xmlns:w15="http://schemas.microsoft.com/office/word/2012/wordml" xmlns:w16cex="http://schemas.microsoft.com/office/word/2018/wordml/cex" xmlns:w16cid="http://schemas.microsoft.com/office/word/2016/wordml/cid" xmlns:w16="http://schemas.microsoft.com/office/word/2018/wordml" xmlns:w16du="http://schemas.microsoft.com/office/word/2023/wordml/word16du" xmlns:w16sdtdh="http://schemas.microsoft.com/office/word/2020/wordml/sdtdatahash" xmlns:w16sdtfl="http://schemas.microsoft.com/office/word/2024/wordml/sdtformatlock" xmlns:w16se="http://schemas.microsoft.com/office/word/2015/wordml/symex" xmlns:wpg="http://schemas.microsoft.com/office/word/2010/wordprocessingGroup" xmlns:wpi="http://schemas.microsoft.com/office/word/2010/wordprocessingInk" xmlns:wne="http://schemas.microsoft.com/office/word/2006/wordml" xmlns:wps="http://schemas.microsoft.com/office/word/2010/wordprocessingShape" mc:Ignorable="w14 w15 w16se w16cid w16 w16cex w16sdtdh w16sdtfl w16du wp14">
   <w:footnote w:type="separator" w:id="-1">
     <w:p>
       <w:r>
@@ -2800,7 +2977,7 @@
 </file>
 
 <file path=word/numbering.xml><?xml version="1.0" encoding="utf-8"?>
-<w:numbering xmlns:wpc="http://schemas.microsoft.com/office/word/2010/wordprocessingCanvas" xmlns:cx="http://schemas.microsoft.com/office/drawing/2014/chartex" xmlns:cx1="http://schemas.microsoft.com/office/drawing/2015/9/8/chartex" xmlns:cx2="http://schemas.microsoft.com/office/drawing/2015/10/21/chartex" xmlns:cx3="http://schemas.microsoft.com/office/drawing/2016/5/9/chartex" xmlns:cx4="http://schemas.microsoft.com/office/drawing/2016/5/10/chartex" xmlns:cx5="http://schemas.microsoft.com/office/drawing/2016/5/11/chartex" xmlns:cx6="http://schemas.microsoft.com/office/drawing/2016/5/12/chartex" xmlns:cx7="http://schemas.microsoft.com/office/drawing/2016/5/13/chartex" xmlns:cx8="http://schemas.microsoft.com/office/drawing/2016/5/14/chartex" xmlns:mc="http://schemas.openxmlformats.org/markup-compatibility/2006" xmlns:aink="http://schemas.microsoft.com/office/drawing/2016/ink" xmlns:am3d="http://schemas.microsoft.com/office/drawing/2017/model3d" xmlns:o="urn:schemas-microsoft-com:office:office" xmlns:r="http://schemas.openxmlformats.org/officeDocument/2006/relationships" xmlns:m="http://schemas.openxmlformats.org/officeDocument/2006/math" xmlns:v="urn:schemas-microsoft-com:vml" xmlns:wp14="http://schemas.microsoft.com/office/word/2010/wordprocessingDrawing" xmlns:wp="http://schemas.openxmlformats.org/drawingml/2006/wordprocessingDrawing" xmlns:w10="urn:schemas-microsoft-com:office:word" xmlns:w="http://schemas.openxmlformats.org/wordprocessingml/2006/main" xmlns:w14="http://schemas.microsoft.com/office/word/2010/wordml" xmlns:w15="http://schemas.microsoft.com/office/word/2012/wordml" xmlns:w16cex="http://schemas.microsoft.com/office/word/2018/wordml/cex" xmlns:w16cid="http://schemas.microsoft.com/office/word/2016/wordml/cid" xmlns:w16="http://schemas.microsoft.com/office/word/2018/wordml" xmlns:w16sdtdh="http://schemas.microsoft.com/office/word/2020/wordml/sdtdatahash" xmlns:w16se="http://schemas.microsoft.com/office/word/2015/wordml/symex" xmlns:wpg="http://schemas.microsoft.com/office/word/2010/wordprocessingGroup" xmlns:wpi="http://schemas.microsoft.com/office/word/2010/wordprocessingInk" xmlns:wne="http://schemas.microsoft.com/office/word/2006/wordml" xmlns:wps="http://schemas.microsoft.com/office/word/2010/wordprocessingShape" mc:Ignorable="w14 w15 w16se w16cid w16 w16cex w16sdtdh wp14">
+<w:numbering xmlns:wpc="http://schemas.microsoft.com/office/word/2010/wordprocessingCanvas" xmlns:cx="http://schemas.microsoft.com/office/drawing/2014/chartex" xmlns:cx1="http://schemas.microsoft.com/office/drawing/2015/9/8/chartex" xmlns:cx2="http://schemas.microsoft.com/office/drawing/2015/10/21/chartex" xmlns:cx3="http://schemas.microsoft.com/office/drawing/2016/5/9/chartex" xmlns:cx4="http://schemas.microsoft.com/office/drawing/2016/5/10/chartex" xmlns:cx5="http://schemas.microsoft.com/office/drawing/2016/5/11/chartex" xmlns:cx6="http://schemas.microsoft.com/office/drawing/2016/5/12/chartex" xmlns:cx7="http://schemas.microsoft.com/office/drawing/2016/5/13/chartex" xmlns:cx8="http://schemas.microsoft.com/office/drawing/2016/5/14/chartex" xmlns:mc="http://schemas.openxmlformats.org/markup-compatibility/2006" xmlns:aink="http://schemas.microsoft.com/office/drawing/2016/ink" xmlns:am3d="http://schemas.microsoft.com/office/drawing/2017/model3d" xmlns:o="urn:schemas-microsoft-com:office:office" xmlns:oel="http://schemas.microsoft.com/office/2019/extlst" xmlns:r="http://schemas.openxmlformats.org/officeDocument/2006/relationships" xmlns:m="http://schemas.openxmlformats.org/officeDocument/2006/math" xmlns:v="urn:schemas-microsoft-com:vml" xmlns:wp14="http://schemas.microsoft.com/office/word/2010/wordprocessingDrawing" xmlns:wp="http://schemas.openxmlformats.org/drawingml/2006/wordprocessingDrawing" xmlns:w10="urn:schemas-microsoft-com:office:word" xmlns:w="http://schemas.openxmlformats.org/wordprocessingml/2006/main" xmlns:w14="http://schemas.microsoft.com/office/word/2010/wordml" xmlns:w15="http://schemas.microsoft.com/office/word/2012/wordml" xmlns:w16cex="http://schemas.microsoft.com/office/word/2018/wordml/cex" xmlns:w16cid="http://schemas.microsoft.com/office/word/2016/wordml/cid" xmlns:w16="http://schemas.microsoft.com/office/word/2018/wordml" xmlns:w16du="http://schemas.microsoft.com/office/word/2023/wordml/word16du" xmlns:w16sdtdh="http://schemas.microsoft.com/office/word/2020/wordml/sdtdatahash" xmlns:w16sdtfl="http://schemas.microsoft.com/office/word/2024/wordml/sdtformatlock" xmlns:w16se="http://schemas.microsoft.com/office/word/2015/wordml/symex" xmlns:wpg="http://schemas.microsoft.com/office/word/2010/wordprocessingGroup" xmlns:wpi="http://schemas.microsoft.com/office/word/2010/wordprocessingInk" xmlns:wne="http://schemas.microsoft.com/office/word/2006/wordml" xmlns:wps="http://schemas.microsoft.com/office/word/2010/wordprocessingShape" mc:Ignorable="w14 w15 w16se w16cid w16 w16cex w16sdtdh w16sdtfl w16du wp14">
   <w:abstractNum w:abstractNumId="0" w15:restartNumberingAfterBreak="0">
     <w:nsid w:val="55712A47"/>
     <w:multiLevelType w:val="multilevel"/>
@@ -3009,17 +3186,17 @@
       </w:rPr>
     </w:lvl>
   </w:abstractNum>
-  <w:num w:numId="1">
+  <w:num w:numId="1" w16cid:durableId="167644088">
     <w:abstractNumId w:val="0"/>
   </w:num>
-  <w:num w:numId="2">
+  <w:num w:numId="2" w16cid:durableId="384763076">
     <w:abstractNumId w:val="1"/>
   </w:num>
 </w:numbering>
 </file>
 
 <file path=word/styles.xml><?xml version="1.0" encoding="utf-8"?>
-<w:styles xmlns:mc="http://schemas.openxmlformats.org/markup-compatibility/2006" xmlns:r="http://schemas.openxmlformats.org/officeDocument/2006/relationships" xmlns:w="http://schemas.openxmlformats.org/wordprocessingml/2006/main" xmlns:w14="http://schemas.microsoft.com/office/word/2010/wordml" xmlns:w15="http://schemas.microsoft.com/office/word/2012/wordml" xmlns:w16cex="http://schemas.microsoft.com/office/word/2018/wordml/cex" xmlns:w16cid="http://schemas.microsoft.com/office/word/2016/wordml/cid" xmlns:w16="http://schemas.microsoft.com/office/word/2018/wordml" xmlns:w16sdtdh="http://schemas.microsoft.com/office/word/2020/wordml/sdtdatahash" xmlns:w16se="http://schemas.microsoft.com/office/word/2015/wordml/symex" mc:Ignorable="w14 w15 w16se w16cid w16 w16cex w16sdtdh">
+<w:styles xmlns:mc="http://schemas.openxmlformats.org/markup-compatibility/2006" xmlns:r="http://schemas.openxmlformats.org/officeDocument/2006/relationships" xmlns:w="http://schemas.openxmlformats.org/wordprocessingml/2006/main" xmlns:w14="http://schemas.microsoft.com/office/word/2010/wordml" xmlns:w15="http://schemas.microsoft.com/office/word/2012/wordml" xmlns:w16cex="http://schemas.microsoft.com/office/word/2018/wordml/cex" xmlns:w16cid="http://schemas.microsoft.com/office/word/2016/wordml/cid" xmlns:w16="http://schemas.microsoft.com/office/word/2018/wordml" xmlns:w16du="http://schemas.microsoft.com/office/word/2023/wordml/word16du" xmlns:w16sdtdh="http://schemas.microsoft.com/office/word/2020/wordml/sdtdatahash" xmlns:w16sdtfl="http://schemas.microsoft.com/office/word/2024/wordml/sdtformatlock" xmlns:w16se="http://schemas.microsoft.com/office/word/2015/wordml/symex" mc:Ignorable="w14 w15 w16se w16cid w16 w16cex w16sdtdh w16sdtfl w16du">
   <w:docDefaults>
     <w:rPrDefault>
       <w:rPr>
@@ -3421,7 +3598,7 @@
     <w:name w:val="Normal"/>
     <w:qFormat/>
   </w:style>
-  <w:style w:type="paragraph" w:styleId="Rubrik1">
+  <w:style w:type="paragraph" w:styleId="Heading1">
     <w:name w:val="heading 1"/>
     <w:basedOn w:val="Heading"/>
     <w:next w:val="Textbody"/>
@@ -3439,7 +3616,7 @@
       <w:szCs w:val="32"/>
     </w:rPr>
   </w:style>
-  <w:style w:type="paragraph" w:styleId="Rubrik2">
+  <w:style w:type="paragraph" w:styleId="Heading2">
     <w:name w:val="heading 2"/>
     <w:basedOn w:val="Heading"/>
     <w:next w:val="Textbody"/>
@@ -3458,7 +3635,7 @@
       <w:iCs/>
     </w:rPr>
   </w:style>
-  <w:style w:type="paragraph" w:styleId="Rubrik3">
+  <w:style w:type="paragraph" w:styleId="Heading3">
     <w:name w:val="heading 3"/>
     <w:basedOn w:val="Heading"/>
     <w:next w:val="Textbody"/>
@@ -3476,13 +3653,13 @@
       <w:bCs/>
     </w:rPr>
   </w:style>
-  <w:style w:type="character" w:default="1" w:styleId="Standardstycketeckensnitt">
+  <w:style w:type="character" w:default="1" w:styleId="DefaultParagraphFont">
     <w:name w:val="Default Paragraph Font"/>
     <w:uiPriority w:val="1"/>
     <w:semiHidden/>
     <w:unhideWhenUsed/>
   </w:style>
-  <w:style w:type="table" w:default="1" w:styleId="Normaltabell">
+  <w:style w:type="table" w:default="1" w:styleId="TableNormal">
     <w:name w:val="Normal Table"/>
     <w:uiPriority w:val="99"/>
     <w:semiHidden/>
@@ -3497,7 +3674,7 @@
       </w:tblCellMar>
     </w:tblPr>
   </w:style>
-  <w:style w:type="numbering" w:default="1" w:styleId="Ingenlista">
+  <w:style w:type="numbering" w:default="1" w:styleId="NoList">
     <w:name w:val="No List"/>
     <w:uiPriority w:val="99"/>
     <w:semiHidden/>
@@ -3527,11 +3704,11 @@
       <w:spacing w:after="115"/>
     </w:pPr>
   </w:style>
-  <w:style w:type="paragraph" w:styleId="Lista">
+  <w:style w:type="paragraph" w:styleId="List">
     <w:name w:val="List"/>
     <w:basedOn w:val="Textbody"/>
   </w:style>
-  <w:style w:type="paragraph" w:styleId="Beskrivning">
+  <w:style w:type="paragraph" w:styleId="Caption">
     <w:name w:val="caption"/>
     <w:basedOn w:val="Standard"/>
     <w:pPr>
@@ -3572,7 +3749,7 @@
     <w:name w:val="Table Contents"/>
     <w:basedOn w:val="Textbody"/>
   </w:style>
-  <w:style w:type="paragraph" w:styleId="Sidfot">
+  <w:style w:type="paragraph" w:styleId="Footer">
     <w:name w:val="footer"/>
     <w:basedOn w:val="Standard"/>
     <w:pPr>
@@ -3583,7 +3760,7 @@
       </w:tabs>
     </w:pPr>
   </w:style>
-  <w:style w:type="paragraph" w:styleId="Sidhuvud">
+  <w:style w:type="paragraph" w:styleId="Header">
     <w:name w:val="header"/>
     <w:basedOn w:val="Standard"/>
     <w:pPr>
@@ -3624,7 +3801,7 @@
       <w:ind w:left="283"/>
     </w:pPr>
   </w:style>
-  <w:style w:type="paragraph" w:styleId="Rubrik">
+  <w:style w:type="paragraph" w:styleId="Title">
     <w:name w:val="Title"/>
     <w:basedOn w:val="Heading"/>
     <w:next w:val="Textbody"/>
@@ -3703,9 +3880,9 @@
       <w:vertAlign w:val="superscript"/>
     </w:rPr>
   </w:style>
-  <w:style w:type="character" w:styleId="Hyperlnk">
+  <w:style w:type="character" w:styleId="Hyperlink">
     <w:name w:val="Hyperlink"/>
-    <w:basedOn w:val="Standardstycketeckensnitt"/>
+    <w:basedOn w:val="DefaultParagraphFont"/>
     <w:uiPriority w:val="99"/>
     <w:unhideWhenUsed/>
     <w:rsid w:val="00423505"/>
@@ -3714,9 +3891,9 @@
       <w:u w:val="single"/>
     </w:rPr>
   </w:style>
-  <w:style w:type="character" w:styleId="Olstomnmnande">
+  <w:style w:type="character" w:styleId="UnresolvedMention">
     <w:name w:val="Unresolved Mention"/>
-    <w:basedOn w:val="Standardstycketeckensnitt"/>
+    <w:basedOn w:val="DefaultParagraphFont"/>
     <w:uiPriority w:val="99"/>
     <w:semiHidden/>
     <w:unhideWhenUsed/>
@@ -3726,9 +3903,9 @@
       <w:shd w:val="clear" w:color="auto" w:fill="E1DFDD"/>
     </w:rPr>
   </w:style>
-  <w:style w:type="character" w:styleId="AnvndHyperlnk">
+  <w:style w:type="character" w:styleId="FollowedHyperlink">
     <w:name w:val="FollowedHyperlink"/>
-    <w:basedOn w:val="Standardstycketeckensnitt"/>
+    <w:basedOn w:val="DefaultParagraphFont"/>
     <w:uiPriority w:val="99"/>
     <w:semiHidden/>
     <w:unhideWhenUsed/>

</xml_diff>